<commit_message>
Add building block test_ble_client and test_ble_server. Updated Lessons doc
</commit_message>
<xml_diff>
--- a/lessons/Lessons.docx
+++ b/lessons/Lessons.docx
@@ -20,7 +20,7 @@
       <w:pPr>
         <w:numPr>
           <w:ilvl w:val="0"/>
-          <w:numId w:val="3"/>
+          <w:numId w:val="6"/>
         </w:numPr>
         <w:ind w:left="720" w:hanging="360"/>
       </w:pPr>
@@ -35,7 +35,7 @@
       <w:pPr>
         <w:numPr>
           <w:ilvl w:val="1"/>
-          <w:numId w:val="3"/>
+          <w:numId w:val="6"/>
         </w:numPr>
         <w:ind w:left="1440" w:hanging="360"/>
       </w:pPr>
@@ -44,6 +44,1290 @@
           <w:rtl w:val="0"/>
         </w:rPr>
         <w:t xml:space="preserve">Label bins</w:t>
+      </w:r>
+    </w:p>
+    <w:p>
+      <w:pPr>
+        <w:numPr>
+          <w:ilvl w:val="0"/>
+          <w:numId w:val="6"/>
+        </w:numPr>
+        <w:ind w:left="720" w:hanging="360"/>
+      </w:pPr>
+      <w:r>
+        <w:rPr>
+          <w:rtl w:val="0"/>
+        </w:rPr>
+        <w:t xml:space="preserve">Robots need a Brain: introduction to the Raspberry Pi Pico</w:t>
+      </w:r>
+    </w:p>
+    <w:p>
+      <w:pPr>
+        <w:numPr>
+          <w:ilvl w:val="0"/>
+          <w:numId w:val="6"/>
+        </w:numPr>
+        <w:ind w:left="720" w:hanging="360"/>
+      </w:pPr>
+      <w:r>
+        <w:rPr>
+          <w:rtl w:val="0"/>
+        </w:rPr>
+        <w:t xml:space="preserve">Install the tools</w:t>
+      </w:r>
+    </w:p>
+    <w:p>
+      <w:pPr>
+        <w:numPr>
+          <w:ilvl w:val="1"/>
+          <w:numId w:val="6"/>
+        </w:numPr>
+        <w:ind w:left="1440" w:hanging="360"/>
+      </w:pPr>
+      <w:r>
+        <w:rPr>
+          <w:rtl w:val="0"/>
+        </w:rPr>
+        <w:t xml:space="preserve">Thonny</w:t>
+      </w:r>
+    </w:p>
+    <w:p>
+      <w:pPr>
+        <w:numPr>
+          <w:ilvl w:val="1"/>
+          <w:numId w:val="6"/>
+        </w:numPr>
+        <w:ind w:left="1440" w:hanging="360"/>
+      </w:pPr>
+      <w:r>
+        <w:rPr>
+          <w:rtl w:val="0"/>
+        </w:rPr>
+        <w:t xml:space="preserve">MicroPython</w:t>
+      </w:r>
+    </w:p>
+    <w:p>
+      <w:pPr>
+        <w:numPr>
+          <w:ilvl w:val="0"/>
+          <w:numId w:val="6"/>
+        </w:numPr>
+        <w:ind w:left="720" w:hanging="360"/>
+      </w:pPr>
+      <w:r>
+        <w:rPr>
+          <w:rtl w:val="0"/>
+        </w:rPr>
+        <w:t xml:space="preserve">Organize your work</w:t>
+      </w:r>
+    </w:p>
+    <w:p>
+      <w:pPr>
+        <w:numPr>
+          <w:ilvl w:val="1"/>
+          <w:numId w:val="6"/>
+        </w:numPr>
+        <w:ind w:left="1440" w:hanging="360"/>
+      </w:pPr>
+      <w:r>
+        <w:rPr>
+          <w:rtl w:val="0"/>
+        </w:rPr>
+        <w:t xml:space="preserve">Create a folder on your computer</w:t>
+      </w:r>
+    </w:p>
+    <w:p>
+      <w:pPr>
+        <w:numPr>
+          <w:ilvl w:val="0"/>
+          <w:numId w:val="6"/>
+        </w:numPr>
+        <w:ind w:left="720" w:hanging="360"/>
+      </w:pPr>
+      <w:r>
+        <w:rPr>
+          <w:rtl w:val="0"/>
+        </w:rPr>
+        <w:t xml:space="preserve">First program: ‘Hello, World!’</w:t>
+      </w:r>
+    </w:p>
+    <w:p>
+      <w:pPr>
+        <w:numPr>
+          <w:ilvl w:val="1"/>
+          <w:numId w:val="6"/>
+        </w:numPr>
+        <w:ind w:left="1440" w:hanging="360"/>
+      </w:pPr>
+      <w:r>
+        <w:rPr>
+          <w:rtl w:val="0"/>
+        </w:rPr>
+        <w:t xml:space="preserve">Tour of Thonny</w:t>
+      </w:r>
+    </w:p>
+    <w:p>
+      <w:pPr>
+        <w:numPr>
+          <w:ilvl w:val="2"/>
+          <w:numId w:val="6"/>
+        </w:numPr>
+        <w:ind w:left="2160" w:hanging="360"/>
+      </w:pPr>
+      <w:r>
+        <w:rPr>
+          <w:rtl w:val="0"/>
+        </w:rPr>
+        <w:t xml:space="preserve">Code area</w:t>
+      </w:r>
+    </w:p>
+    <w:p>
+      <w:pPr>
+        <w:numPr>
+          <w:ilvl w:val="2"/>
+          <w:numId w:val="6"/>
+        </w:numPr>
+        <w:ind w:left="2160" w:hanging="360"/>
+      </w:pPr>
+      <w:r>
+        <w:rPr>
+          <w:rtl w:val="0"/>
+        </w:rPr>
+        <w:t xml:space="preserve">File area</w:t>
+      </w:r>
+    </w:p>
+    <w:p>
+      <w:pPr>
+        <w:numPr>
+          <w:ilvl w:val="2"/>
+          <w:numId w:val="6"/>
+        </w:numPr>
+        <w:ind w:left="2160" w:hanging="360"/>
+      </w:pPr>
+      <w:r>
+        <w:rPr>
+          <w:rtl w:val="0"/>
+        </w:rPr>
+        <w:t xml:space="preserve">Console / Terminal</w:t>
+      </w:r>
+    </w:p>
+    <w:p>
+      <w:pPr>
+        <w:numPr>
+          <w:ilvl w:val="2"/>
+          <w:numId w:val="6"/>
+        </w:numPr>
+        <w:ind w:left="2160" w:hanging="360"/>
+      </w:pPr>
+      <w:r>
+        <w:rPr>
+          <w:rtl w:val="0"/>
+        </w:rPr>
+        <w:t xml:space="preserve">Selecting MicroPython</w:t>
+      </w:r>
+    </w:p>
+    <w:p>
+      <w:pPr>
+        <w:numPr>
+          <w:ilvl w:val="1"/>
+          <w:numId w:val="6"/>
+        </w:numPr>
+        <w:ind w:left="1440" w:hanging="360"/>
+      </w:pPr>
+      <w:r>
+        <w:rPr>
+          <w:rtl w:val="0"/>
+        </w:rPr>
+        <w:t xml:space="preserve">Intro to Python</w:t>
+      </w:r>
+    </w:p>
+    <w:p>
+      <w:pPr>
+        <w:numPr>
+          <w:ilvl w:val="1"/>
+          <w:numId w:val="6"/>
+        </w:numPr>
+        <w:ind w:left="1440" w:hanging="360"/>
+      </w:pPr>
+      <w:r>
+        <w:rPr>
+          <w:rtl w:val="0"/>
+        </w:rPr>
+        <w:t xml:space="preserve">Writing, storing and running a program</w:t>
+      </w:r>
+    </w:p>
+    <w:p>
+      <w:pPr>
+        <w:ind w:left="720" w:firstLine="0"/>
+        <w:rPr/>
+      </w:pPr>
+      <w:r>
+        <w:rPr>
+          <w:rtl w:val="0"/>
+        </w:rPr>
+      </w:r>
+    </w:p>
+    <w:p>
+      <w:pPr>
+        <w:pStyle w:val="Heading1"/>
+        <w:rPr/>
+      </w:pPr>
+      <w:bookmarkStart w:colFirst="0" w:colLast="0" w:name="_udiv97bwp0fj" w:id="1"/>
+      <w:bookmarkEnd w:id="1"/>
+      <w:r>
+        <w:rPr>
+          <w:rtl w:val="0"/>
+        </w:rPr>
+        <w:t xml:space="preserve">Lesson 2: Blink an LED</w:t>
+      </w:r>
+    </w:p>
+    <w:p>
+      <w:pPr>
+        <w:numPr>
+          <w:ilvl w:val="0"/>
+          <w:numId w:val="9"/>
+        </w:numPr>
+        <w:ind w:left="720" w:hanging="360"/>
+      </w:pPr>
+      <w:r>
+        <w:rPr>
+          <w:rtl w:val="0"/>
+        </w:rPr>
+        <w:t xml:space="preserve">Using the Pico: inputs and outputs</w:t>
+      </w:r>
+    </w:p>
+    <w:p>
+      <w:pPr>
+        <w:numPr>
+          <w:ilvl w:val="0"/>
+          <w:numId w:val="9"/>
+        </w:numPr>
+        <w:ind w:left="720" w:hanging="360"/>
+      </w:pPr>
+      <w:r>
+        <w:rPr>
+          <w:rtl w:val="0"/>
+        </w:rPr>
+        <w:t xml:space="preserve">Electronic fundamentals:</w:t>
+      </w:r>
+    </w:p>
+    <w:p>
+      <w:pPr>
+        <w:numPr>
+          <w:ilvl w:val="1"/>
+          <w:numId w:val="9"/>
+        </w:numPr>
+        <w:ind w:left="1440" w:hanging="360"/>
+      </w:pPr>
+      <w:r>
+        <w:rPr>
+          <w:rtl w:val="0"/>
+        </w:rPr>
+        <w:t xml:space="preserve">Voltage, Current, Circuit</w:t>
+      </w:r>
+    </w:p>
+    <w:p>
+      <w:pPr>
+        <w:numPr>
+          <w:ilvl w:val="1"/>
+          <w:numId w:val="9"/>
+        </w:numPr>
+        <w:ind w:left="1440" w:hanging="360"/>
+      </w:pPr>
+      <w:r>
+        <w:rPr>
+          <w:rtl w:val="0"/>
+        </w:rPr>
+        <w:t xml:space="preserve">Using breadboards</w:t>
+      </w:r>
+    </w:p>
+    <w:p>
+      <w:pPr>
+        <w:numPr>
+          <w:ilvl w:val="1"/>
+          <w:numId w:val="9"/>
+        </w:numPr>
+        <w:ind w:left="1440" w:hanging="360"/>
+      </w:pPr>
+      <w:r>
+        <w:rPr>
+          <w:rtl w:val="0"/>
+        </w:rPr>
+        <w:t xml:space="preserve">Pinout diagrams</w:t>
+      </w:r>
+    </w:p>
+    <w:p>
+      <w:pPr>
+        <w:numPr>
+          <w:ilvl w:val="0"/>
+          <w:numId w:val="9"/>
+        </w:numPr>
+        <w:ind w:left="720" w:hanging="360"/>
+      </w:pPr>
+      <w:r>
+        <w:rPr>
+          <w:rtl w:val="0"/>
+        </w:rPr>
+        <w:t xml:space="preserve">Parts of a Pico program</w:t>
+      </w:r>
+    </w:p>
+    <w:p>
+      <w:pPr>
+        <w:numPr>
+          <w:ilvl w:val="1"/>
+          <w:numId w:val="9"/>
+        </w:numPr>
+        <w:ind w:left="1440" w:hanging="360"/>
+      </w:pPr>
+      <w:r>
+        <w:rPr>
+          <w:rtl w:val="0"/>
+        </w:rPr>
+        <w:t xml:space="preserve">Import software you will need (machine, time)</w:t>
+      </w:r>
+    </w:p>
+    <w:p>
+      <w:pPr>
+        <w:numPr>
+          <w:ilvl w:val="1"/>
+          <w:numId w:val="9"/>
+        </w:numPr>
+        <w:ind w:left="1440" w:hanging="360"/>
+      </w:pPr>
+      <w:r>
+        <w:rPr>
+          <w:rtl w:val="0"/>
+        </w:rPr>
+        <w:t xml:space="preserve">Assign the pins</w:t>
+      </w:r>
+    </w:p>
+    <w:p>
+      <w:pPr>
+        <w:numPr>
+          <w:ilvl w:val="1"/>
+          <w:numId w:val="9"/>
+        </w:numPr>
+        <w:ind w:left="1440" w:hanging="360"/>
+      </w:pPr>
+      <w:r>
+        <w:rPr>
+          <w:rtl w:val="0"/>
+        </w:rPr>
+        <w:t xml:space="preserve">Use the pins</w:t>
+      </w:r>
+    </w:p>
+    <w:p>
+      <w:pPr>
+        <w:numPr>
+          <w:ilvl w:val="0"/>
+          <w:numId w:val="9"/>
+        </w:numPr>
+        <w:ind w:left="720" w:hanging="360"/>
+        <w:rPr>
+          <w:u w:val="none"/>
+        </w:rPr>
+      </w:pPr>
+      <w:r>
+        <w:rPr>
+          <w:rtl w:val="0"/>
+        </w:rPr>
+        <w:t xml:space="preserve">Digital output</w:t>
+      </w:r>
+    </w:p>
+    <w:p>
+      <w:pPr>
+        <w:numPr>
+          <w:ilvl w:val="0"/>
+          <w:numId w:val="9"/>
+        </w:numPr>
+        <w:ind w:left="720" w:hanging="360"/>
+      </w:pPr>
+      <w:r>
+        <w:rPr>
+          <w:rtl w:val="0"/>
+        </w:rPr>
+        <w:t xml:space="preserve">Some more Python:</w:t>
+      </w:r>
+    </w:p>
+    <w:p>
+      <w:pPr>
+        <w:numPr>
+          <w:ilvl w:val="1"/>
+          <w:numId w:val="9"/>
+        </w:numPr>
+        <w:ind w:left="1440" w:hanging="360"/>
+      </w:pPr>
+      <w:r>
+        <w:rPr>
+          <w:rtl w:val="0"/>
+        </w:rPr>
+        <w:t xml:space="preserve">while loop</w:t>
+      </w:r>
+    </w:p>
+    <w:p>
+      <w:pPr>
+        <w:numPr>
+          <w:ilvl w:val="0"/>
+          <w:numId w:val="9"/>
+        </w:numPr>
+        <w:ind w:left="720" w:hanging="360"/>
+      </w:pPr>
+      <w:r>
+        <w:rPr>
+          <w:rtl w:val="0"/>
+        </w:rPr>
+        <w:t xml:space="preserve">The classic blink program</w:t>
+      </w:r>
+    </w:p>
+    <w:p>
+      <w:pPr>
+        <w:numPr>
+          <w:ilvl w:val="0"/>
+          <w:numId w:val="9"/>
+        </w:numPr>
+        <w:ind w:left="720" w:hanging="360"/>
+        <w:rPr>
+          <w:u w:val="none"/>
+        </w:rPr>
+      </w:pPr>
+      <w:r>
+        <w:rPr>
+          <w:rtl w:val="0"/>
+        </w:rPr>
+        <w:t xml:space="preserve">Challenge: Make a Traffic Light. It should have red, green and yellow LEDS which blink in sequence.</w:t>
+      </w:r>
+    </w:p>
+    <w:p>
+      <w:pPr>
+        <w:rPr/>
+      </w:pPr>
+      <w:r>
+        <w:rPr>
+          <w:rtl w:val="0"/>
+        </w:rPr>
+      </w:r>
+    </w:p>
+    <w:p>
+      <w:pPr>
+        <w:rPr/>
+      </w:pPr>
+      <w:r>
+        <w:rPr>
+          <w:rtl w:val="0"/>
+        </w:rPr>
+      </w:r>
+    </w:p>
+    <w:p>
+      <w:pPr>
+        <w:rPr/>
+      </w:pPr>
+      <w:r>
+        <w:rPr>
+          <w:rtl w:val="0"/>
+        </w:rPr>
+      </w:r>
+    </w:p>
+    <w:p>
+      <w:pPr>
+        <w:pStyle w:val="Heading1"/>
+        <w:rPr/>
+      </w:pPr>
+      <w:bookmarkStart w:colFirst="0" w:colLast="0" w:name="_1m67ptfpn7b3" w:id="2"/>
+      <w:bookmarkEnd w:id="2"/>
+      <w:r>
+        <w:rPr>
+          <w:rtl w:val="0"/>
+        </w:rPr>
+        <w:t xml:space="preserve">Lesson 3: User Input and Variables</w:t>
+      </w:r>
+    </w:p>
+    <w:p>
+      <w:pPr>
+        <w:numPr>
+          <w:ilvl w:val="0"/>
+          <w:numId w:val="7"/>
+        </w:numPr>
+        <w:ind w:left="720" w:hanging="360"/>
+      </w:pPr>
+      <w:r>
+        <w:rPr>
+          <w:rtl w:val="0"/>
+        </w:rPr>
+        <w:t xml:space="preserve">Using the input method to read in a value and store it in a variable</w:t>
+      </w:r>
+    </w:p>
+    <w:p>
+      <w:pPr>
+        <w:numPr>
+          <w:ilvl w:val="0"/>
+          <w:numId w:val="7"/>
+        </w:numPr>
+        <w:ind w:left="720" w:hanging="360"/>
+        <w:rPr>
+          <w:u w:val="none"/>
+        </w:rPr>
+      </w:pPr>
+      <w:r>
+        <w:rPr>
+          <w:rtl w:val="0"/>
+        </w:rPr>
+        <w:t xml:space="preserve">All about variables</w:t>
+      </w:r>
+    </w:p>
+    <w:p>
+      <w:pPr>
+        <w:numPr>
+          <w:ilvl w:val="1"/>
+          <w:numId w:val="7"/>
+        </w:numPr>
+        <w:ind w:left="1440" w:hanging="360"/>
+        <w:rPr>
+          <w:u w:val="none"/>
+        </w:rPr>
+      </w:pPr>
+      <w:r>
+        <w:rPr>
+          <w:rtl w:val="0"/>
+        </w:rPr>
+        <w:t xml:space="preserve">Named storage for information you will use later</w:t>
+      </w:r>
+    </w:p>
+    <w:p>
+      <w:pPr>
+        <w:numPr>
+          <w:ilvl w:val="1"/>
+          <w:numId w:val="7"/>
+        </w:numPr>
+        <w:ind w:left="1440" w:hanging="360"/>
+        <w:rPr>
+          <w:u w:val="none"/>
+        </w:rPr>
+      </w:pPr>
+      <w:r>
+        <w:rPr>
+          <w:rtl w:val="0"/>
+        </w:rPr>
+        <w:t xml:space="preserve">Name, type, value, scope</w:t>
+      </w:r>
+    </w:p>
+    <w:p>
+      <w:pPr>
+        <w:numPr>
+          <w:ilvl w:val="0"/>
+          <w:numId w:val="7"/>
+        </w:numPr>
+        <w:ind w:left="720" w:hanging="360"/>
+        <w:rPr>
+          <w:u w:val="none"/>
+        </w:rPr>
+      </w:pPr>
+      <w:r>
+        <w:rPr>
+          <w:rtl w:val="0"/>
+        </w:rPr>
+        <w:t xml:space="preserve">Using a variable in your program</w:t>
+      </w:r>
+    </w:p>
+    <w:p>
+      <w:pPr>
+        <w:numPr>
+          <w:ilvl w:val="1"/>
+          <w:numId w:val="7"/>
+        </w:numPr>
+        <w:ind w:left="1440" w:hanging="360"/>
+        <w:rPr>
+          <w:u w:val="none"/>
+        </w:rPr>
+      </w:pPr>
+      <w:r>
+        <w:rPr>
+          <w:rtl w:val="0"/>
+        </w:rPr>
+        <w:t xml:space="preserve">Use it to control the blink rate of an LED</w:t>
+      </w:r>
+    </w:p>
+    <w:p>
+      <w:pPr>
+        <w:rPr/>
+      </w:pPr>
+      <w:r>
+        <w:rPr>
+          <w:rtl w:val="0"/>
+        </w:rPr>
+      </w:r>
+    </w:p>
+    <w:p>
+      <w:pPr>
+        <w:pStyle w:val="Heading1"/>
+        <w:rPr/>
+      </w:pPr>
+      <w:bookmarkStart w:colFirst="0" w:colLast="0" w:name="_tbtwi1akc43p" w:id="3"/>
+      <w:bookmarkEnd w:id="3"/>
+      <w:r>
+        <w:rPr>
+          <w:rtl w:val="0"/>
+        </w:rPr>
+        <w:t xml:space="preserve">Lesson 4: Circuit Diagrams</w:t>
+      </w:r>
+    </w:p>
+    <w:p>
+      <w:pPr>
+        <w:numPr>
+          <w:ilvl w:val="0"/>
+          <w:numId w:val="8"/>
+        </w:numPr>
+        <w:ind w:left="720" w:hanging="360"/>
+        <w:rPr>
+          <w:u w:val="none"/>
+        </w:rPr>
+      </w:pPr>
+      <w:r>
+        <w:rPr>
+          <w:rtl w:val="0"/>
+        </w:rPr>
+        <w:t xml:space="preserve">Microcontrollers interact with external devices using circuits</w:t>
+      </w:r>
+    </w:p>
+    <w:p>
+      <w:pPr>
+        <w:numPr>
+          <w:ilvl w:val="0"/>
+          <w:numId w:val="8"/>
+        </w:numPr>
+        <w:ind w:left="720" w:hanging="360"/>
+        <w:rPr>
+          <w:u w:val="none"/>
+        </w:rPr>
+      </w:pPr>
+      <w:r>
+        <w:rPr>
+          <w:rtl w:val="0"/>
+        </w:rPr>
+        <w:t xml:space="preserve">Why do we use circuit diagrams?</w:t>
+      </w:r>
+    </w:p>
+    <w:p>
+      <w:pPr>
+        <w:numPr>
+          <w:ilvl w:val="0"/>
+          <w:numId w:val="8"/>
+        </w:numPr>
+        <w:ind w:left="720" w:hanging="360"/>
+        <w:rPr>
+          <w:u w:val="none"/>
+        </w:rPr>
+      </w:pPr>
+      <w:r>
+        <w:rPr>
+          <w:rtl w:val="0"/>
+        </w:rPr>
+        <w:t xml:space="preserve">Common Circuit Symbols</w:t>
+      </w:r>
+    </w:p>
+    <w:p>
+      <w:pPr>
+        <w:numPr>
+          <w:ilvl w:val="1"/>
+          <w:numId w:val="8"/>
+        </w:numPr>
+        <w:ind w:left="1440" w:hanging="360"/>
+        <w:rPr>
+          <w:u w:val="none"/>
+        </w:rPr>
+      </w:pPr>
+      <w:r>
+        <w:rPr>
+          <w:rtl w:val="0"/>
+        </w:rPr>
+        <w:t xml:space="preserve">LEDs</w:t>
+      </w:r>
+    </w:p>
+    <w:p>
+      <w:pPr>
+        <w:numPr>
+          <w:ilvl w:val="1"/>
+          <w:numId w:val="8"/>
+        </w:numPr>
+        <w:ind w:left="1440" w:hanging="360"/>
+        <w:rPr>
+          <w:u w:val="none"/>
+        </w:rPr>
+      </w:pPr>
+      <w:r>
+        <w:rPr>
+          <w:rtl w:val="0"/>
+        </w:rPr>
+        <w:t xml:space="preserve">Buttons</w:t>
+      </w:r>
+    </w:p>
+    <w:p>
+      <w:pPr>
+        <w:numPr>
+          <w:ilvl w:val="1"/>
+          <w:numId w:val="8"/>
+        </w:numPr>
+        <w:ind w:left="1440" w:hanging="360"/>
+        <w:rPr>
+          <w:u w:val="none"/>
+        </w:rPr>
+      </w:pPr>
+      <w:r>
+        <w:rPr>
+          <w:rtl w:val="0"/>
+        </w:rPr>
+        <w:t xml:space="preserve">Pins</w:t>
+      </w:r>
+    </w:p>
+    <w:p>
+      <w:pPr>
+        <w:numPr>
+          <w:ilvl w:val="1"/>
+          <w:numId w:val="8"/>
+        </w:numPr>
+        <w:ind w:left="1440" w:hanging="360"/>
+        <w:rPr>
+          <w:u w:val="none"/>
+        </w:rPr>
+      </w:pPr>
+      <w:r>
+        <w:rPr>
+          <w:rtl w:val="0"/>
+        </w:rPr>
+        <w:t xml:space="preserve">Batteries</w:t>
+      </w:r>
+    </w:p>
+    <w:p>
+      <w:pPr>
+        <w:pStyle w:val="Heading1"/>
+        <w:rPr/>
+      </w:pPr>
+      <w:bookmarkStart w:colFirst="0" w:colLast="0" w:name="_1rl8q764adzc" w:id="4"/>
+      <w:bookmarkEnd w:id="4"/>
+      <w:r>
+        <w:rPr>
+          <w:rtl w:val="0"/>
+        </w:rPr>
+        <w:t xml:space="preserve">Lesson 5: Digital Input</w:t>
+      </w:r>
+    </w:p>
+    <w:p>
+      <w:pPr>
+        <w:numPr>
+          <w:ilvl w:val="0"/>
+          <w:numId w:val="10"/>
+        </w:numPr>
+        <w:ind w:left="720" w:hanging="360"/>
+        <w:rPr>
+          <w:u w:val="none"/>
+        </w:rPr>
+      </w:pPr>
+      <w:r>
+        <w:rPr>
+          <w:rtl w:val="0"/>
+        </w:rPr>
+        <w:t xml:space="preserve">Digital Input</w:t>
+      </w:r>
+    </w:p>
+    <w:p>
+      <w:pPr>
+        <w:numPr>
+          <w:ilvl w:val="0"/>
+          <w:numId w:val="10"/>
+        </w:numPr>
+        <w:ind w:left="720" w:hanging="360"/>
+        <w:rPr>
+          <w:u w:val="none"/>
+        </w:rPr>
+      </w:pPr>
+      <w:r>
+        <w:rPr>
+          <w:rtl w:val="0"/>
+        </w:rPr>
+        <w:t xml:space="preserve">Reading in a digital value from a button</w:t>
+      </w:r>
+    </w:p>
+    <w:p>
+      <w:pPr>
+        <w:numPr>
+          <w:ilvl w:val="0"/>
+          <w:numId w:val="10"/>
+        </w:numPr>
+        <w:ind w:left="720" w:hanging="360"/>
+        <w:rPr>
+          <w:u w:val="none"/>
+        </w:rPr>
+      </w:pPr>
+      <w:r>
+        <w:rPr>
+          <w:rtl w:val="0"/>
+        </w:rPr>
+        <w:t xml:space="preserve">Note that you will need </w:t>
+      </w:r>
+    </w:p>
+    <w:p>
+      <w:pPr>
+        <w:numPr>
+          <w:ilvl w:val="0"/>
+          <w:numId w:val="10"/>
+        </w:numPr>
+        <w:ind w:left="720" w:hanging="360"/>
+        <w:rPr>
+          <w:u w:val="none"/>
+        </w:rPr>
+      </w:pPr>
+      <w:r>
+        <w:rPr>
+          <w:rtl w:val="0"/>
+        </w:rPr>
+        <w:t xml:space="preserve">Using the Thonny plotter to show the button value</w:t>
+      </w:r>
+    </w:p>
+    <w:p>
+      <w:pPr>
+        <w:numPr>
+          <w:ilvl w:val="0"/>
+          <w:numId w:val="10"/>
+        </w:numPr>
+        <w:ind w:left="720" w:hanging="360"/>
+        <w:rPr>
+          <w:u w:val="none"/>
+        </w:rPr>
+      </w:pPr>
+      <w:r>
+        <w:rPr>
+          <w:rtl w:val="0"/>
+        </w:rPr>
+        <w:t xml:space="preserve">Using the digital value to turn on an LED</w:t>
+      </w:r>
+    </w:p>
+    <w:p>
+      <w:pPr>
+        <w:numPr>
+          <w:ilvl w:val="0"/>
+          <w:numId w:val="10"/>
+        </w:numPr>
+        <w:ind w:left="720" w:hanging="360"/>
+        <w:rPr>
+          <w:u w:val="none"/>
+        </w:rPr>
+      </w:pPr>
+      <w:r>
+        <w:rPr>
+          <w:rtl w:val="0"/>
+        </w:rPr>
+        <w:t xml:space="preserve">Conditionals in Python</w:t>
+      </w:r>
+    </w:p>
+    <w:p>
+      <w:pPr>
+        <w:numPr>
+          <w:ilvl w:val="0"/>
+          <w:numId w:val="10"/>
+        </w:numPr>
+        <w:ind w:left="720" w:hanging="360"/>
+        <w:rPr>
+          <w:u w:val="none"/>
+        </w:rPr>
+      </w:pPr>
+      <w:r>
+        <w:rPr>
+          <w:rtl w:val="0"/>
+        </w:rPr>
+        <w:t xml:space="preserve">Exercise: Use two buttons, one to turn the led on, one to turn the LED off</w:t>
+      </w:r>
+    </w:p>
+    <w:p>
+      <w:pPr>
+        <w:pStyle w:val="Heading1"/>
+        <w:rPr/>
+      </w:pPr>
+      <w:bookmarkStart w:colFirst="0" w:colLast="0" w:name="_b04owyurayrx" w:id="5"/>
+      <w:bookmarkEnd w:id="5"/>
+      <w:r>
+        <w:rPr>
+          <w:rtl w:val="0"/>
+        </w:rPr>
+        <w:t xml:space="preserve">Lesson 6: Analog Input</w:t>
+      </w:r>
+    </w:p>
+    <w:p>
+      <w:pPr>
+        <w:numPr>
+          <w:ilvl w:val="0"/>
+          <w:numId w:val="4"/>
+        </w:numPr>
+        <w:ind w:left="720" w:hanging="360"/>
+        <w:rPr>
+          <w:u w:val="none"/>
+        </w:rPr>
+      </w:pPr>
+      <w:r>
+        <w:rPr>
+          <w:rtl w:val="0"/>
+        </w:rPr>
+        <w:t xml:space="preserve">Using resistors in a circuit: voltage drops across resistors</w:t>
+      </w:r>
+    </w:p>
+    <w:p>
+      <w:pPr>
+        <w:numPr>
+          <w:ilvl w:val="0"/>
+          <w:numId w:val="4"/>
+        </w:numPr>
+        <w:ind w:left="720" w:hanging="360"/>
+        <w:rPr>
+          <w:u w:val="none"/>
+        </w:rPr>
+      </w:pPr>
+      <w:r>
+        <w:rPr>
+          <w:rtl w:val="0"/>
+        </w:rPr>
+        <w:t xml:space="preserve">Voltage divider</w:t>
+      </w:r>
+    </w:p>
+    <w:p>
+      <w:pPr>
+        <w:numPr>
+          <w:ilvl w:val="0"/>
+          <w:numId w:val="4"/>
+        </w:numPr>
+        <w:ind w:left="720" w:hanging="360"/>
+        <w:rPr>
+          <w:u w:val="none"/>
+        </w:rPr>
+      </w:pPr>
+      <w:r>
+        <w:rPr>
+          <w:rtl w:val="0"/>
+        </w:rPr>
+        <w:t xml:space="preserve">Potentiometer - create a circuit</w:t>
+      </w:r>
+    </w:p>
+    <w:p>
+      <w:pPr>
+        <w:numPr>
+          <w:ilvl w:val="0"/>
+          <w:numId w:val="4"/>
+        </w:numPr>
+        <w:ind w:left="720" w:hanging="360"/>
+        <w:rPr>
+          <w:u w:val="none"/>
+        </w:rPr>
+      </w:pPr>
+      <w:r>
+        <w:rPr>
+          <w:rtl w:val="0"/>
+        </w:rPr>
+        <w:t xml:space="preserve">Analog input to the Pico - show plot</w:t>
+      </w:r>
+    </w:p>
+    <w:p>
+      <w:pPr>
+        <w:numPr>
+          <w:ilvl w:val="0"/>
+          <w:numId w:val="4"/>
+        </w:numPr>
+        <w:ind w:left="720" w:hanging="360"/>
+        <w:rPr>
+          <w:u w:val="none"/>
+        </w:rPr>
+      </w:pPr>
+      <w:r>
+        <w:rPr>
+          <w:rtl w:val="0"/>
+        </w:rPr>
+        <w:t xml:space="preserve">Use the value to control a blink rate</w:t>
+      </w:r>
+    </w:p>
+    <w:p>
+      <w:pPr>
+        <w:pStyle w:val="Heading1"/>
+        <w:rPr/>
+      </w:pPr>
+      <w:bookmarkStart w:colFirst="0" w:colLast="0" w:name="_9m7l5x8asule" w:id="6"/>
+      <w:bookmarkEnd w:id="6"/>
+      <w:r>
+        <w:rPr>
+          <w:rtl w:val="0"/>
+        </w:rPr>
+        <w:t xml:space="preserve">Lesson 7: Analog Output</w:t>
+      </w:r>
+    </w:p>
+    <w:p>
+      <w:pPr>
+        <w:numPr>
+          <w:ilvl w:val="0"/>
+          <w:numId w:val="1"/>
+        </w:numPr>
+        <w:ind w:left="720" w:hanging="360"/>
+        <w:rPr>
+          <w:u w:val="none"/>
+        </w:rPr>
+      </w:pPr>
+      <w:r>
+        <w:rPr>
+          <w:rtl w:val="0"/>
+        </w:rPr>
+        <w:t xml:space="preserve">Pico’s do not have analog output</w:t>
+      </w:r>
+    </w:p>
+    <w:p>
+      <w:pPr>
+        <w:numPr>
+          <w:ilvl w:val="0"/>
+          <w:numId w:val="1"/>
+        </w:numPr>
+        <w:ind w:left="720" w:hanging="360"/>
+        <w:rPr>
+          <w:u w:val="none"/>
+        </w:rPr>
+      </w:pPr>
+      <w:r>
+        <w:rPr>
+          <w:rtl w:val="0"/>
+        </w:rPr>
+        <w:t xml:space="preserve">PWM</w:t>
+      </w:r>
+    </w:p>
+    <w:p>
+      <w:pPr>
+        <w:numPr>
+          <w:ilvl w:val="0"/>
+          <w:numId w:val="1"/>
+        </w:numPr>
+        <w:ind w:left="720" w:hanging="360"/>
+        <w:rPr>
+          <w:u w:val="none"/>
+        </w:rPr>
+      </w:pPr>
+      <w:r>
+        <w:rPr>
+          <w:rtl w:val="0"/>
+        </w:rPr>
+        <w:t xml:space="preserve">Buzzers</w:t>
+      </w:r>
+    </w:p>
+    <w:p>
+      <w:pPr>
+        <w:pStyle w:val="Heading1"/>
+        <w:rPr/>
+      </w:pPr>
+      <w:bookmarkStart w:colFirst="0" w:colLast="0" w:name="_pou854lyvdeb" w:id="7"/>
+      <w:bookmarkEnd w:id="7"/>
+      <w:r>
+        <w:rPr>
+          <w:rtl w:val="0"/>
+        </w:rPr>
+        <w:t xml:space="preserve">Lesson 8: Smart Devices</w:t>
+      </w:r>
+    </w:p>
+    <w:p>
+      <w:pPr>
+        <w:numPr>
+          <w:ilvl w:val="0"/>
+          <w:numId w:val="2"/>
+        </w:numPr>
+        <w:ind w:left="720" w:hanging="360"/>
+        <w:rPr>
+          <w:u w:val="none"/>
+        </w:rPr>
+      </w:pPr>
+      <w:r>
+        <w:rPr>
+          <w:rtl w:val="0"/>
+        </w:rPr>
+        <w:t xml:space="preserve">Servos use PWM for control, but software libraries simplify their use.</w:t>
+      </w:r>
+    </w:p>
+    <w:p>
+      <w:pPr>
+        <w:numPr>
+          <w:ilvl w:val="0"/>
+          <w:numId w:val="2"/>
+        </w:numPr>
+        <w:ind w:left="720" w:hanging="360"/>
+        <w:rPr>
+          <w:u w:val="none"/>
+        </w:rPr>
+      </w:pPr>
+      <w:r>
+        <w:rPr>
+          <w:rtl w:val="0"/>
+        </w:rPr>
+        <w:t xml:space="preserve">Challenge: build an interesting or fun device that is controlled by a servo</w:t>
+      </w:r>
+    </w:p>
+    <w:p>
+      <w:pPr>
+        <w:numPr>
+          <w:ilvl w:val="0"/>
+          <w:numId w:val="2"/>
+        </w:numPr>
+        <w:ind w:left="720" w:hanging="360"/>
+        <w:rPr>
+          <w:u w:val="none"/>
+        </w:rPr>
+      </w:pPr>
+      <w:r>
+        <w:rPr>
+          <w:rtl w:val="0"/>
+        </w:rPr>
+        <w:t xml:space="preserve">Using the I2C bus to send messages.</w:t>
+      </w:r>
+    </w:p>
+    <w:p>
+      <w:pPr>
+        <w:numPr>
+          <w:ilvl w:val="1"/>
+          <w:numId w:val="2"/>
+        </w:numPr>
+        <w:ind w:left="1440" w:hanging="360"/>
+        <w:rPr>
+          <w:u w:val="none"/>
+        </w:rPr>
+      </w:pPr>
+      <w:r>
+        <w:rPr>
+          <w:rtl w:val="0"/>
+        </w:rPr>
+        <w:t xml:space="preserve">OLEDs</w:t>
+      </w:r>
+    </w:p>
+    <w:p>
+      <w:pPr>
+        <w:numPr>
+          <w:ilvl w:val="1"/>
+          <w:numId w:val="2"/>
+        </w:numPr>
+        <w:ind w:left="1440" w:hanging="360"/>
+        <w:rPr>
+          <w:u w:val="none"/>
+        </w:rPr>
+      </w:pPr>
+      <w:r>
+        <w:rPr>
+          <w:rtl w:val="0"/>
+        </w:rPr>
+        <w:t xml:space="preserve">I2C</w:t>
+      </w:r>
+    </w:p>
+    <w:p>
+      <w:pPr>
+        <w:pStyle w:val="Heading1"/>
+        <w:rPr/>
+      </w:pPr>
+      <w:bookmarkStart w:colFirst="0" w:colLast="0" w:name="_pdsk8yeorcgf" w:id="8"/>
+      <w:bookmarkEnd w:id="8"/>
+      <w:r>
+        <w:rPr>
+          <w:rtl w:val="0"/>
+        </w:rPr>
+        <w:t xml:space="preserve">Lesson 9: Bluetooth (BLE)</w:t>
+      </w:r>
+    </w:p>
+    <w:p>
+      <w:pPr>
+        <w:numPr>
+          <w:ilvl w:val="0"/>
+          <w:numId w:val="5"/>
+        </w:numPr>
+        <w:ind w:left="720" w:hanging="360"/>
+        <w:rPr>
+          <w:u w:val="none"/>
+        </w:rPr>
+      </w:pPr>
+      <w:r>
+        <w:rPr>
+          <w:rtl w:val="0"/>
+        </w:rPr>
+        <w:t xml:space="preserve">Cover functions if not already done.</w:t>
+      </w:r>
+    </w:p>
+    <w:p>
+      <w:pPr>
+        <w:numPr>
+          <w:ilvl w:val="0"/>
+          <w:numId w:val="5"/>
+        </w:numPr>
+        <w:ind w:left="720" w:hanging="360"/>
+        <w:rPr>
+          <w:u w:val="none"/>
+        </w:rPr>
+      </w:pPr>
+      <w:r>
+        <w:rPr>
+          <w:rtl w:val="0"/>
+        </w:rPr>
+        <w:t xml:space="preserve">Use test_ble_server and test_ble_client as examples to walk through using the bluetooth library classes to establish communication between two picos. Note that these use callback functions.</w:t>
+      </w:r>
+    </w:p>
+    <w:p>
+      <w:pPr>
+        <w:numPr>
+          <w:ilvl w:val="0"/>
+          <w:numId w:val="5"/>
+        </w:numPr>
+        <w:ind w:left="720" w:hanging="360"/>
+        <w:rPr>
+          <w:u w:val="none"/>
+        </w:rPr>
+      </w:pPr>
+      <w:r>
+        <w:rPr>
+          <w:rtl w:val="0"/>
+        </w:rPr>
+        <w:t xml:space="preserve">Challenge: use information sent between server and client to do something:</w:t>
+      </w:r>
+    </w:p>
+    <w:p>
+      <w:pPr>
+        <w:numPr>
+          <w:ilvl w:val="1"/>
+          <w:numId w:val="5"/>
+        </w:numPr>
+        <w:ind w:left="1440" w:hanging="360"/>
+        <w:rPr>
+          <w:u w:val="none"/>
+        </w:rPr>
+      </w:pPr>
+      <w:r>
+        <w:rPr>
+          <w:rtl w:val="0"/>
+        </w:rPr>
+        <w:t xml:space="preserve">Server button lights up Client LED</w:t>
+      </w:r>
+    </w:p>
+    <w:p>
+      <w:pPr>
+        <w:numPr>
+          <w:ilvl w:val="1"/>
+          <w:numId w:val="5"/>
+        </w:numPr>
+        <w:ind w:left="1440" w:hanging="360"/>
+        <w:rPr>
+          <w:u w:val="none"/>
+        </w:rPr>
+      </w:pPr>
+      <w:r>
+        <w:rPr>
+          <w:rtl w:val="0"/>
+        </w:rPr>
+        <w:t xml:space="preserve">Server button launches rubber band controlled</w:t>
+      </w:r>
+    </w:p>
+    <w:p>
+      <w:pPr>
+        <w:pStyle w:val="Heading1"/>
+        <w:rPr/>
+      </w:pPr>
+      <w:bookmarkStart w:colFirst="0" w:colLast="0" w:name="_lly07nr7p68b" w:id="9"/>
+      <w:bookmarkEnd w:id="9"/>
+      <w:r>
+        <w:rPr>
+          <w:rtl w:val="0"/>
+        </w:rPr>
+        <w:t xml:space="preserve">Lesson 10: Radio-Controlled Robot</w:t>
       </w:r>
     </w:p>
     <w:p>
@@ -53,12 +1337,15 @@
           <w:numId w:val="3"/>
         </w:numPr>
         <w:ind w:left="720" w:hanging="360"/>
-      </w:pPr>
-      <w:r>
-        <w:rPr>
-          <w:rtl w:val="0"/>
-        </w:rPr>
-        <w:t xml:space="preserve">Robots need a Brain: introduction to the Raspberry Pi Pico</w:t>
+        <w:rPr>
+          <w:u w:val="none"/>
+        </w:rPr>
+      </w:pPr>
+      <w:r>
+        <w:rPr>
+          <w:rtl w:val="0"/>
+        </w:rPr>
+        <w:t xml:space="preserve">Build on the Bluetooth lesson</w:t>
       </w:r>
     </w:p>
     <w:p>
@@ -68,42 +1355,15 @@
           <w:numId w:val="3"/>
         </w:numPr>
         <w:ind w:left="720" w:hanging="360"/>
-      </w:pPr>
-      <w:r>
-        <w:rPr>
-          <w:rtl w:val="0"/>
-        </w:rPr>
-        <w:t xml:space="preserve">Install the tools</w:t>
-      </w:r>
-    </w:p>
-    <w:p>
-      <w:pPr>
-        <w:numPr>
-          <w:ilvl w:val="1"/>
-          <w:numId w:val="3"/>
-        </w:numPr>
-        <w:ind w:left="1440" w:hanging="360"/>
-      </w:pPr>
-      <w:r>
-        <w:rPr>
-          <w:rtl w:val="0"/>
-        </w:rPr>
-        <w:t xml:space="preserve">Thonny</w:t>
-      </w:r>
-    </w:p>
-    <w:p>
-      <w:pPr>
-        <w:numPr>
-          <w:ilvl w:val="1"/>
-          <w:numId w:val="3"/>
-        </w:numPr>
-        <w:ind w:left="1440" w:hanging="360"/>
-      </w:pPr>
-      <w:r>
-        <w:rPr>
-          <w:rtl w:val="0"/>
-        </w:rPr>
-        <w:t xml:space="preserve">MicroPython</w:t>
+        <w:rPr>
+          <w:u w:val="none"/>
+        </w:rPr>
+      </w:pPr>
+      <w:r>
+        <w:rPr>
+          <w:rtl w:val="0"/>
+        </w:rPr>
+        <w:t xml:space="preserve">Add two joysticks to the server side. Use analog input to capture 2 or 3 of the joystick locations (Pico only has 3 analog inputs!) and 2 for the buttons, because why not.</w:t>
       </w:r>
     </w:p>
     <w:p>
@@ -113,27 +1373,15 @@
           <w:numId w:val="3"/>
         </w:numPr>
         <w:ind w:left="720" w:hanging="360"/>
-      </w:pPr>
-      <w:r>
-        <w:rPr>
-          <w:rtl w:val="0"/>
-        </w:rPr>
-        <w:t xml:space="preserve">Organize your work</w:t>
-      </w:r>
-    </w:p>
-    <w:p>
-      <w:pPr>
-        <w:numPr>
-          <w:ilvl w:val="1"/>
-          <w:numId w:val="3"/>
-        </w:numPr>
-        <w:ind w:left="1440" w:hanging="360"/>
-      </w:pPr>
-      <w:r>
-        <w:rPr>
-          <w:rtl w:val="0"/>
-        </w:rPr>
-        <w:t xml:space="preserve">Create a folder on your computer</w:t>
+        <w:rPr>
+          <w:u w:val="none"/>
+        </w:rPr>
+      </w:pPr>
+      <w:r>
+        <w:rPr>
+          <w:rtl w:val="0"/>
+        </w:rPr>
+        <w:t xml:space="preserve">On the client side, add a motor driver.</w:t>
       </w:r>
     </w:p>
     <w:p>
@@ -143,286 +1391,6 @@
           <w:numId w:val="3"/>
         </w:numPr>
         <w:ind w:left="720" w:hanging="360"/>
-      </w:pPr>
-      <w:r>
-        <w:rPr>
-          <w:rtl w:val="0"/>
-        </w:rPr>
-        <w:t xml:space="preserve">First program: ‘Hello, World!’</w:t>
-      </w:r>
-    </w:p>
-    <w:p>
-      <w:pPr>
-        <w:numPr>
-          <w:ilvl w:val="1"/>
-          <w:numId w:val="3"/>
-        </w:numPr>
-        <w:ind w:left="1440" w:hanging="360"/>
-      </w:pPr>
-      <w:r>
-        <w:rPr>
-          <w:rtl w:val="0"/>
-        </w:rPr>
-        <w:t xml:space="preserve">Tour of Thonny</w:t>
-      </w:r>
-    </w:p>
-    <w:p>
-      <w:pPr>
-        <w:numPr>
-          <w:ilvl w:val="2"/>
-          <w:numId w:val="3"/>
-        </w:numPr>
-        <w:ind w:left="2160" w:hanging="360"/>
-      </w:pPr>
-      <w:r>
-        <w:rPr>
-          <w:rtl w:val="0"/>
-        </w:rPr>
-        <w:t xml:space="preserve">Code area</w:t>
-      </w:r>
-    </w:p>
-    <w:p>
-      <w:pPr>
-        <w:numPr>
-          <w:ilvl w:val="2"/>
-          <w:numId w:val="3"/>
-        </w:numPr>
-        <w:ind w:left="2160" w:hanging="360"/>
-      </w:pPr>
-      <w:r>
-        <w:rPr>
-          <w:rtl w:val="0"/>
-        </w:rPr>
-        <w:t xml:space="preserve">File area</w:t>
-      </w:r>
-    </w:p>
-    <w:p>
-      <w:pPr>
-        <w:numPr>
-          <w:ilvl w:val="2"/>
-          <w:numId w:val="3"/>
-        </w:numPr>
-        <w:ind w:left="2160" w:hanging="360"/>
-      </w:pPr>
-      <w:r>
-        <w:rPr>
-          <w:rtl w:val="0"/>
-        </w:rPr>
-        <w:t xml:space="preserve">Console / Terminal</w:t>
-      </w:r>
-    </w:p>
-    <w:p>
-      <w:pPr>
-        <w:numPr>
-          <w:ilvl w:val="2"/>
-          <w:numId w:val="3"/>
-        </w:numPr>
-        <w:ind w:left="2160" w:hanging="360"/>
-      </w:pPr>
-      <w:r>
-        <w:rPr>
-          <w:rtl w:val="0"/>
-        </w:rPr>
-        <w:t xml:space="preserve">Selecting MicroPython</w:t>
-      </w:r>
-    </w:p>
-    <w:p>
-      <w:pPr>
-        <w:numPr>
-          <w:ilvl w:val="1"/>
-          <w:numId w:val="3"/>
-        </w:numPr>
-        <w:ind w:left="1440" w:hanging="360"/>
-      </w:pPr>
-      <w:r>
-        <w:rPr>
-          <w:rtl w:val="0"/>
-        </w:rPr>
-        <w:t xml:space="preserve">Intro to Python</w:t>
-      </w:r>
-    </w:p>
-    <w:p>
-      <w:pPr>
-        <w:numPr>
-          <w:ilvl w:val="1"/>
-          <w:numId w:val="3"/>
-        </w:numPr>
-        <w:ind w:left="1440" w:hanging="360"/>
-      </w:pPr>
-      <w:r>
-        <w:rPr>
-          <w:rtl w:val="0"/>
-        </w:rPr>
-        <w:t xml:space="preserve">Writing, storing and running a program</w:t>
-      </w:r>
-    </w:p>
-    <w:p>
-      <w:pPr>
-        <w:ind w:left="720" w:firstLine="0"/>
-        <w:rPr/>
-      </w:pPr>
-      <w:r>
-        <w:rPr>
-          <w:rtl w:val="0"/>
-        </w:rPr>
-      </w:r>
-    </w:p>
-    <w:p>
-      <w:pPr>
-        <w:pStyle w:val="Heading1"/>
-        <w:rPr/>
-      </w:pPr>
-      <w:bookmarkStart w:colFirst="0" w:colLast="0" w:name="_udiv97bwp0fj" w:id="1"/>
-      <w:bookmarkEnd w:id="1"/>
-      <w:r>
-        <w:rPr>
-          <w:rtl w:val="0"/>
-        </w:rPr>
-        <w:t xml:space="preserve">Lesson 2: Blink an LED</w:t>
-      </w:r>
-    </w:p>
-    <w:p>
-      <w:pPr>
-        <w:numPr>
-          <w:ilvl w:val="0"/>
-          <w:numId w:val="6"/>
-        </w:numPr>
-        <w:ind w:left="720" w:hanging="360"/>
-      </w:pPr>
-      <w:r>
-        <w:rPr>
-          <w:rtl w:val="0"/>
-        </w:rPr>
-        <w:t xml:space="preserve">Using the Pico: inputs and outputs</w:t>
-      </w:r>
-    </w:p>
-    <w:p>
-      <w:pPr>
-        <w:numPr>
-          <w:ilvl w:val="0"/>
-          <w:numId w:val="6"/>
-        </w:numPr>
-        <w:ind w:left="720" w:hanging="360"/>
-      </w:pPr>
-      <w:r>
-        <w:rPr>
-          <w:rtl w:val="0"/>
-        </w:rPr>
-        <w:t xml:space="preserve">Electronic fundamentals:</w:t>
-      </w:r>
-    </w:p>
-    <w:p>
-      <w:pPr>
-        <w:numPr>
-          <w:ilvl w:val="1"/>
-          <w:numId w:val="6"/>
-        </w:numPr>
-        <w:ind w:left="1440" w:hanging="360"/>
-      </w:pPr>
-      <w:r>
-        <w:rPr>
-          <w:rtl w:val="0"/>
-        </w:rPr>
-        <w:t xml:space="preserve">Voltage, Current, Circuit</w:t>
-      </w:r>
-    </w:p>
-    <w:p>
-      <w:pPr>
-        <w:numPr>
-          <w:ilvl w:val="1"/>
-          <w:numId w:val="6"/>
-        </w:numPr>
-        <w:ind w:left="1440" w:hanging="360"/>
-      </w:pPr>
-      <w:r>
-        <w:rPr>
-          <w:rtl w:val="0"/>
-        </w:rPr>
-        <w:t xml:space="preserve">Using breadboards</w:t>
-      </w:r>
-    </w:p>
-    <w:p>
-      <w:pPr>
-        <w:numPr>
-          <w:ilvl w:val="1"/>
-          <w:numId w:val="6"/>
-        </w:numPr>
-        <w:ind w:left="1440" w:hanging="360"/>
-      </w:pPr>
-      <w:r>
-        <w:rPr>
-          <w:rtl w:val="0"/>
-        </w:rPr>
-        <w:t xml:space="preserve">Pinout diagrams</w:t>
-      </w:r>
-    </w:p>
-    <w:p>
-      <w:pPr>
-        <w:numPr>
-          <w:ilvl w:val="0"/>
-          <w:numId w:val="6"/>
-        </w:numPr>
-        <w:ind w:left="720" w:hanging="360"/>
-      </w:pPr>
-      <w:r>
-        <w:rPr>
-          <w:rtl w:val="0"/>
-        </w:rPr>
-        <w:t xml:space="preserve">Parts of a Pico program</w:t>
-      </w:r>
-    </w:p>
-    <w:p>
-      <w:pPr>
-        <w:numPr>
-          <w:ilvl w:val="1"/>
-          <w:numId w:val="6"/>
-        </w:numPr>
-        <w:ind w:left="1440" w:hanging="360"/>
-      </w:pPr>
-      <w:r>
-        <w:rPr>
-          <w:rtl w:val="0"/>
-        </w:rPr>
-        <w:t xml:space="preserve">Import software you will need (machine, time)</w:t>
-      </w:r>
-    </w:p>
-    <w:p>
-      <w:pPr>
-        <w:numPr>
-          <w:ilvl w:val="1"/>
-          <w:numId w:val="6"/>
-        </w:numPr>
-        <w:ind w:left="1440" w:hanging="360"/>
-      </w:pPr>
-      <w:r>
-        <w:rPr>
-          <w:rtl w:val="0"/>
-        </w:rPr>
-        <w:t xml:space="preserve">Assign the pins</w:t>
-      </w:r>
-    </w:p>
-    <w:p>
-      <w:pPr>
-        <w:numPr>
-          <w:ilvl w:val="1"/>
-          <w:numId w:val="6"/>
-        </w:numPr>
-        <w:ind w:left="1440" w:hanging="360"/>
-      </w:pPr>
-      <w:r>
-        <w:rPr>
-          <w:rtl w:val="0"/>
-        </w:rPr>
-        <w:t xml:space="preserve">Use the pins</w:t>
-      </w:r>
-    </w:p>
-    <w:p>
-      <w:pPr>
-        <w:numPr>
-          <w:ilvl w:val="0"/>
-          <w:numId w:val="6"/>
-        </w:numPr>
-        <w:ind w:left="720" w:hanging="360"/>
         <w:rPr>
           <w:u w:val="none"/>
         </w:rPr>
@@ -431,743 +1399,7 @@
         <w:rPr>
           <w:rtl w:val="0"/>
         </w:rPr>
-        <w:t xml:space="preserve">Digital output</w:t>
-      </w:r>
-    </w:p>
-    <w:p>
-      <w:pPr>
-        <w:numPr>
-          <w:ilvl w:val="0"/>
-          <w:numId w:val="6"/>
-        </w:numPr>
-        <w:ind w:left="720" w:hanging="360"/>
-      </w:pPr>
-      <w:r>
-        <w:rPr>
-          <w:rtl w:val="0"/>
-        </w:rPr>
-        <w:t xml:space="preserve">Some more Python:</w:t>
-      </w:r>
-    </w:p>
-    <w:p>
-      <w:pPr>
-        <w:numPr>
-          <w:ilvl w:val="1"/>
-          <w:numId w:val="6"/>
-        </w:numPr>
-        <w:ind w:left="1440" w:hanging="360"/>
-      </w:pPr>
-      <w:r>
-        <w:rPr>
-          <w:rtl w:val="0"/>
-        </w:rPr>
-        <w:t xml:space="preserve">while loop</w:t>
-      </w:r>
-    </w:p>
-    <w:p>
-      <w:pPr>
-        <w:numPr>
-          <w:ilvl w:val="0"/>
-          <w:numId w:val="6"/>
-        </w:numPr>
-        <w:ind w:left="720" w:hanging="360"/>
-      </w:pPr>
-      <w:r>
-        <w:rPr>
-          <w:rtl w:val="0"/>
-        </w:rPr>
-        <w:t xml:space="preserve">The classic blink program</w:t>
-      </w:r>
-    </w:p>
-    <w:p>
-      <w:pPr>
-        <w:numPr>
-          <w:ilvl w:val="0"/>
-          <w:numId w:val="6"/>
-        </w:numPr>
-        <w:ind w:left="720" w:hanging="360"/>
-        <w:rPr>
-          <w:u w:val="none"/>
-        </w:rPr>
-      </w:pPr>
-      <w:r>
-        <w:rPr>
-          <w:rtl w:val="0"/>
-        </w:rPr>
-        <w:t xml:space="preserve">Challenge: Make a Traffic Light. It should have red, green and yellow LEDS which blink in sequence.</w:t>
-      </w:r>
-    </w:p>
-    <w:p>
-      <w:pPr>
-        <w:rPr/>
-      </w:pPr>
-      <w:r>
-        <w:rPr>
-          <w:rtl w:val="0"/>
-        </w:rPr>
-      </w:r>
-    </w:p>
-    <w:p>
-      <w:pPr>
-        <w:rPr/>
-      </w:pPr>
-      <w:r>
-        <w:rPr>
-          <w:rtl w:val="0"/>
-        </w:rPr>
-      </w:r>
-    </w:p>
-    <w:p>
-      <w:pPr>
-        <w:rPr/>
-      </w:pPr>
-      <w:r>
-        <w:rPr>
-          <w:rtl w:val="0"/>
-        </w:rPr>
-      </w:r>
-    </w:p>
-    <w:p>
-      <w:pPr>
-        <w:pStyle w:val="Heading1"/>
-        <w:rPr/>
-      </w:pPr>
-      <w:bookmarkStart w:colFirst="0" w:colLast="0" w:name="_1m67ptfpn7b3" w:id="2"/>
-      <w:bookmarkEnd w:id="2"/>
-      <w:r>
-        <w:rPr>
-          <w:rtl w:val="0"/>
-        </w:rPr>
-        <w:t xml:space="preserve">Lesson 3: User Input and Variables</w:t>
-      </w:r>
-    </w:p>
-    <w:p>
-      <w:pPr>
-        <w:numPr>
-          <w:ilvl w:val="0"/>
-          <w:numId w:val="4"/>
-        </w:numPr>
-        <w:ind w:left="720" w:hanging="360"/>
-      </w:pPr>
-      <w:r>
-        <w:rPr>
-          <w:rtl w:val="0"/>
-        </w:rPr>
-        <w:t xml:space="preserve">Using the input method to read in a value and store it in a variable</w:t>
-      </w:r>
-    </w:p>
-    <w:p>
-      <w:pPr>
-        <w:numPr>
-          <w:ilvl w:val="0"/>
-          <w:numId w:val="4"/>
-        </w:numPr>
-        <w:ind w:left="720" w:hanging="360"/>
-        <w:rPr>
-          <w:u w:val="none"/>
-        </w:rPr>
-      </w:pPr>
-      <w:r>
-        <w:rPr>
-          <w:rtl w:val="0"/>
-        </w:rPr>
-        <w:t xml:space="preserve">All about variables</w:t>
-      </w:r>
-    </w:p>
-    <w:p>
-      <w:pPr>
-        <w:numPr>
-          <w:ilvl w:val="1"/>
-          <w:numId w:val="4"/>
-        </w:numPr>
-        <w:ind w:left="1440" w:hanging="360"/>
-        <w:rPr>
-          <w:u w:val="none"/>
-        </w:rPr>
-      </w:pPr>
-      <w:r>
-        <w:rPr>
-          <w:rtl w:val="0"/>
-        </w:rPr>
-        <w:t xml:space="preserve">Named storage for information you will use later</w:t>
-      </w:r>
-    </w:p>
-    <w:p>
-      <w:pPr>
-        <w:numPr>
-          <w:ilvl w:val="1"/>
-          <w:numId w:val="4"/>
-        </w:numPr>
-        <w:ind w:left="1440" w:hanging="360"/>
-        <w:rPr>
-          <w:u w:val="none"/>
-        </w:rPr>
-      </w:pPr>
-      <w:r>
-        <w:rPr>
-          <w:rtl w:val="0"/>
-        </w:rPr>
-        <w:t xml:space="preserve">Name, type, value, scope</w:t>
-      </w:r>
-    </w:p>
-    <w:p>
-      <w:pPr>
-        <w:numPr>
-          <w:ilvl w:val="0"/>
-          <w:numId w:val="4"/>
-        </w:numPr>
-        <w:ind w:left="720" w:hanging="360"/>
-        <w:rPr>
-          <w:u w:val="none"/>
-        </w:rPr>
-      </w:pPr>
-      <w:r>
-        <w:rPr>
-          <w:rtl w:val="0"/>
-        </w:rPr>
-        <w:t xml:space="preserve">Using a variable in your program</w:t>
-      </w:r>
-    </w:p>
-    <w:p>
-      <w:pPr>
-        <w:numPr>
-          <w:ilvl w:val="1"/>
-          <w:numId w:val="4"/>
-        </w:numPr>
-        <w:ind w:left="1440" w:hanging="360"/>
-        <w:rPr>
-          <w:u w:val="none"/>
-        </w:rPr>
-      </w:pPr>
-      <w:r>
-        <w:rPr>
-          <w:rtl w:val="0"/>
-        </w:rPr>
-        <w:t xml:space="preserve">Use it to control the blink rate of an LED</w:t>
-      </w:r>
-    </w:p>
-    <w:p>
-      <w:pPr>
-        <w:rPr/>
-      </w:pPr>
-      <w:r>
-        <w:rPr>
-          <w:rtl w:val="0"/>
-        </w:rPr>
-      </w:r>
-    </w:p>
-    <w:p>
-      <w:pPr>
-        <w:pStyle w:val="Heading1"/>
-        <w:rPr/>
-      </w:pPr>
-      <w:bookmarkStart w:colFirst="0" w:colLast="0" w:name="_tbtwi1akc43p" w:id="3"/>
-      <w:bookmarkEnd w:id="3"/>
-      <w:r>
-        <w:rPr>
-          <w:rtl w:val="0"/>
-        </w:rPr>
-        <w:t xml:space="preserve">Lesson 4: Circuit Diagrams</w:t>
-      </w:r>
-    </w:p>
-    <w:p>
-      <w:pPr>
-        <w:numPr>
-          <w:ilvl w:val="0"/>
-          <w:numId w:val="5"/>
-        </w:numPr>
-        <w:ind w:left="720" w:hanging="360"/>
-        <w:rPr>
-          <w:u w:val="none"/>
-        </w:rPr>
-      </w:pPr>
-      <w:r>
-        <w:rPr>
-          <w:rtl w:val="0"/>
-        </w:rPr>
-        <w:t xml:space="preserve">Microcontrollers interact with external devices using circuits</w:t>
-      </w:r>
-    </w:p>
-    <w:p>
-      <w:pPr>
-        <w:numPr>
-          <w:ilvl w:val="0"/>
-          <w:numId w:val="5"/>
-        </w:numPr>
-        <w:ind w:left="720" w:hanging="360"/>
-        <w:rPr>
-          <w:u w:val="none"/>
-        </w:rPr>
-      </w:pPr>
-      <w:r>
-        <w:rPr>
-          <w:rtl w:val="0"/>
-        </w:rPr>
-        <w:t xml:space="preserve">Why do we use circuit diagrams?</w:t>
-      </w:r>
-    </w:p>
-    <w:p>
-      <w:pPr>
-        <w:numPr>
-          <w:ilvl w:val="0"/>
-          <w:numId w:val="5"/>
-        </w:numPr>
-        <w:ind w:left="720" w:hanging="360"/>
-        <w:rPr>
-          <w:u w:val="none"/>
-        </w:rPr>
-      </w:pPr>
-      <w:r>
-        <w:rPr>
-          <w:rtl w:val="0"/>
-        </w:rPr>
-        <w:t xml:space="preserve">Common Circuit Symbols</w:t>
-      </w:r>
-    </w:p>
-    <w:p>
-      <w:pPr>
-        <w:numPr>
-          <w:ilvl w:val="1"/>
-          <w:numId w:val="5"/>
-        </w:numPr>
-        <w:ind w:left="1440" w:hanging="360"/>
-        <w:rPr>
-          <w:u w:val="none"/>
-        </w:rPr>
-      </w:pPr>
-      <w:r>
-        <w:rPr>
-          <w:rtl w:val="0"/>
-        </w:rPr>
-        <w:t xml:space="preserve">LEDs</w:t>
-      </w:r>
-    </w:p>
-    <w:p>
-      <w:pPr>
-        <w:numPr>
-          <w:ilvl w:val="1"/>
-          <w:numId w:val="5"/>
-        </w:numPr>
-        <w:ind w:left="1440" w:hanging="360"/>
-        <w:rPr>
-          <w:u w:val="none"/>
-        </w:rPr>
-      </w:pPr>
-      <w:r>
-        <w:rPr>
-          <w:rtl w:val="0"/>
-        </w:rPr>
-        <w:t xml:space="preserve">Buttons</w:t>
-      </w:r>
-    </w:p>
-    <w:p>
-      <w:pPr>
-        <w:numPr>
-          <w:ilvl w:val="1"/>
-          <w:numId w:val="5"/>
-        </w:numPr>
-        <w:ind w:left="1440" w:hanging="360"/>
-        <w:rPr>
-          <w:u w:val="none"/>
-        </w:rPr>
-      </w:pPr>
-      <w:r>
-        <w:rPr>
-          <w:rtl w:val="0"/>
-        </w:rPr>
-        <w:t xml:space="preserve">Pins</w:t>
-      </w:r>
-    </w:p>
-    <w:p>
-      <w:pPr>
-        <w:numPr>
-          <w:ilvl w:val="1"/>
-          <w:numId w:val="5"/>
-        </w:numPr>
-        <w:ind w:left="1440" w:hanging="360"/>
-        <w:rPr>
-          <w:u w:val="none"/>
-        </w:rPr>
-      </w:pPr>
-      <w:r>
-        <w:rPr>
-          <w:rtl w:val="0"/>
-        </w:rPr>
-        <w:t xml:space="preserve">Batteries</w:t>
-      </w:r>
-    </w:p>
-    <w:p>
-      <w:pPr>
-        <w:pStyle w:val="Heading1"/>
-        <w:rPr/>
-      </w:pPr>
-      <w:bookmarkStart w:colFirst="0" w:colLast="0" w:name="_1rl8q764adzc" w:id="4"/>
-      <w:bookmarkEnd w:id="4"/>
-      <w:r>
-        <w:rPr>
-          <w:rtl w:val="0"/>
-        </w:rPr>
-        <w:t xml:space="preserve">Lesson 5: Digital Input</w:t>
-      </w:r>
-    </w:p>
-    <w:p>
-      <w:pPr>
-        <w:numPr>
-          <w:ilvl w:val="0"/>
-          <w:numId w:val="7"/>
-        </w:numPr>
-        <w:ind w:left="720" w:hanging="360"/>
-        <w:rPr>
-          <w:u w:val="none"/>
-        </w:rPr>
-      </w:pPr>
-      <w:r>
-        <w:rPr>
-          <w:rtl w:val="0"/>
-        </w:rPr>
-        <w:t xml:space="preserve">Digital Input</w:t>
-      </w:r>
-    </w:p>
-    <w:p>
-      <w:pPr>
-        <w:numPr>
-          <w:ilvl w:val="0"/>
-          <w:numId w:val="7"/>
-        </w:numPr>
-        <w:ind w:left="720" w:hanging="360"/>
-        <w:rPr>
-          <w:u w:val="none"/>
-        </w:rPr>
-      </w:pPr>
-      <w:r>
-        <w:rPr>
-          <w:rtl w:val="0"/>
-        </w:rPr>
-        <w:t xml:space="preserve">Reading in a digital value from a button</w:t>
-      </w:r>
-    </w:p>
-    <w:p>
-      <w:pPr>
-        <w:numPr>
-          <w:ilvl w:val="0"/>
-          <w:numId w:val="7"/>
-        </w:numPr>
-        <w:ind w:left="720" w:hanging="360"/>
-        <w:rPr>
-          <w:u w:val="none"/>
-        </w:rPr>
-      </w:pPr>
-      <w:r>
-        <w:rPr>
-          <w:rtl w:val="0"/>
-        </w:rPr>
-        <w:t xml:space="preserve">Note that you will need </w:t>
-      </w:r>
-    </w:p>
-    <w:p>
-      <w:pPr>
-        <w:numPr>
-          <w:ilvl w:val="0"/>
-          <w:numId w:val="7"/>
-        </w:numPr>
-        <w:ind w:left="720" w:hanging="360"/>
-        <w:rPr>
-          <w:u w:val="none"/>
-        </w:rPr>
-      </w:pPr>
-      <w:r>
-        <w:rPr>
-          <w:rtl w:val="0"/>
-        </w:rPr>
-        <w:t xml:space="preserve">Using the Thonny plotter to show the button value</w:t>
-      </w:r>
-    </w:p>
-    <w:p>
-      <w:pPr>
-        <w:numPr>
-          <w:ilvl w:val="0"/>
-          <w:numId w:val="7"/>
-        </w:numPr>
-        <w:ind w:left="720" w:hanging="360"/>
-        <w:rPr>
-          <w:u w:val="none"/>
-        </w:rPr>
-      </w:pPr>
-      <w:r>
-        <w:rPr>
-          <w:rtl w:val="0"/>
-        </w:rPr>
-        <w:t xml:space="preserve">Using the digital value to turn on an LED</w:t>
-      </w:r>
-    </w:p>
-    <w:p>
-      <w:pPr>
-        <w:numPr>
-          <w:ilvl w:val="0"/>
-          <w:numId w:val="7"/>
-        </w:numPr>
-        <w:ind w:left="720" w:hanging="360"/>
-        <w:rPr>
-          <w:u w:val="none"/>
-        </w:rPr>
-      </w:pPr>
-      <w:r>
-        <w:rPr>
-          <w:rtl w:val="0"/>
-        </w:rPr>
-        <w:t xml:space="preserve">Conditionals in Python</w:t>
-      </w:r>
-    </w:p>
-    <w:p>
-      <w:pPr>
-        <w:numPr>
-          <w:ilvl w:val="0"/>
-          <w:numId w:val="7"/>
-        </w:numPr>
-        <w:ind w:left="720" w:hanging="360"/>
-        <w:rPr>
-          <w:u w:val="none"/>
-        </w:rPr>
-      </w:pPr>
-      <w:r>
-        <w:rPr>
-          <w:rtl w:val="0"/>
-        </w:rPr>
-        <w:t xml:space="preserve">Exercise: Use two buttons, one to turn the led on, one to turn the LED off</w:t>
-      </w:r>
-    </w:p>
-    <w:p>
-      <w:pPr>
-        <w:pStyle w:val="Heading1"/>
-        <w:rPr/>
-      </w:pPr>
-      <w:bookmarkStart w:colFirst="0" w:colLast="0" w:name="_b04owyurayrx" w:id="5"/>
-      <w:bookmarkEnd w:id="5"/>
-      <w:r>
-        <w:rPr>
-          <w:rtl w:val="0"/>
-        </w:rPr>
-        <w:t xml:space="preserve">Lesson 6: Analog Input</w:t>
-      </w:r>
-    </w:p>
-    <w:p>
-      <w:pPr>
-        <w:numPr>
-          <w:ilvl w:val="0"/>
-          <w:numId w:val="2"/>
-        </w:numPr>
-        <w:ind w:left="720" w:hanging="360"/>
-        <w:rPr>
-          <w:u w:val="none"/>
-        </w:rPr>
-      </w:pPr>
-      <w:r>
-        <w:rPr>
-          <w:rtl w:val="0"/>
-        </w:rPr>
-        <w:t xml:space="preserve">Using resistors in a circuit: voltage drops across resistors</w:t>
-      </w:r>
-    </w:p>
-    <w:p>
-      <w:pPr>
-        <w:numPr>
-          <w:ilvl w:val="0"/>
-          <w:numId w:val="2"/>
-        </w:numPr>
-        <w:ind w:left="720" w:hanging="360"/>
-        <w:rPr>
-          <w:u w:val="none"/>
-        </w:rPr>
-      </w:pPr>
-      <w:r>
-        <w:rPr>
-          <w:rtl w:val="0"/>
-        </w:rPr>
-        <w:t xml:space="preserve">Voltage divider</w:t>
-      </w:r>
-    </w:p>
-    <w:p>
-      <w:pPr>
-        <w:numPr>
-          <w:ilvl w:val="0"/>
-          <w:numId w:val="2"/>
-        </w:numPr>
-        <w:ind w:left="720" w:hanging="360"/>
-        <w:rPr>
-          <w:u w:val="none"/>
-        </w:rPr>
-      </w:pPr>
-      <w:r>
-        <w:rPr>
-          <w:rtl w:val="0"/>
-        </w:rPr>
-        <w:t xml:space="preserve">Potentiometer - create a circuit</w:t>
-      </w:r>
-    </w:p>
-    <w:p>
-      <w:pPr>
-        <w:numPr>
-          <w:ilvl w:val="0"/>
-          <w:numId w:val="2"/>
-        </w:numPr>
-        <w:ind w:left="720" w:hanging="360"/>
-        <w:rPr>
-          <w:u w:val="none"/>
-        </w:rPr>
-      </w:pPr>
-      <w:r>
-        <w:rPr>
-          <w:rtl w:val="0"/>
-        </w:rPr>
-        <w:t xml:space="preserve">Analog input to the Pico - show plot</w:t>
-      </w:r>
-    </w:p>
-    <w:p>
-      <w:pPr>
-        <w:numPr>
-          <w:ilvl w:val="0"/>
-          <w:numId w:val="2"/>
-        </w:numPr>
-        <w:ind w:left="720" w:hanging="360"/>
-        <w:rPr>
-          <w:u w:val="none"/>
-        </w:rPr>
-      </w:pPr>
-      <w:r>
-        <w:rPr>
-          <w:rtl w:val="0"/>
-        </w:rPr>
-        <w:t xml:space="preserve">Use the value to control a blink rate</w:t>
-      </w:r>
-    </w:p>
-    <w:p>
-      <w:pPr>
-        <w:pStyle w:val="Heading1"/>
-        <w:rPr/>
-      </w:pPr>
-      <w:bookmarkStart w:colFirst="0" w:colLast="0" w:name="_9m7l5x8asule" w:id="6"/>
-      <w:bookmarkEnd w:id="6"/>
-      <w:r>
-        <w:rPr>
-          <w:rtl w:val="0"/>
-        </w:rPr>
-        <w:t xml:space="preserve">Lesson 7: Analog Output</w:t>
-      </w:r>
-    </w:p>
-    <w:p>
-      <w:pPr>
-        <w:numPr>
-          <w:ilvl w:val="0"/>
-          <w:numId w:val="1"/>
-        </w:numPr>
-        <w:ind w:left="720" w:hanging="360"/>
-        <w:rPr>
-          <w:u w:val="none"/>
-        </w:rPr>
-      </w:pPr>
-      <w:r>
-        <w:rPr>
-          <w:rtl w:val="0"/>
-        </w:rPr>
-        <w:t xml:space="preserve">Pico’s do not have analog output</w:t>
-      </w:r>
-    </w:p>
-    <w:p>
-      <w:pPr>
-        <w:numPr>
-          <w:ilvl w:val="0"/>
-          <w:numId w:val="1"/>
-        </w:numPr>
-        <w:ind w:left="720" w:hanging="360"/>
-        <w:rPr>
-          <w:u w:val="none"/>
-        </w:rPr>
-      </w:pPr>
-      <w:r>
-        <w:rPr>
-          <w:rtl w:val="0"/>
-        </w:rPr>
-        <w:t xml:space="preserve">PWM</w:t>
-      </w:r>
-    </w:p>
-    <w:p>
-      <w:pPr>
-        <w:numPr>
-          <w:ilvl w:val="0"/>
-          <w:numId w:val="1"/>
-        </w:numPr>
-        <w:ind w:left="720" w:hanging="360"/>
-        <w:rPr>
-          <w:u w:val="none"/>
-        </w:rPr>
-      </w:pPr>
-      <w:r>
-        <w:rPr>
-          <w:rtl w:val="0"/>
-        </w:rPr>
-        <w:t xml:space="preserve">Buzzers</w:t>
-      </w:r>
-    </w:p>
-    <w:p>
-      <w:pPr>
-        <w:pStyle w:val="Heading1"/>
-        <w:rPr/>
-      </w:pPr>
-      <w:bookmarkStart w:colFirst="0" w:colLast="0" w:name="_pou854lyvdeb" w:id="7"/>
-      <w:bookmarkEnd w:id="7"/>
-      <w:r>
-        <w:rPr>
-          <w:rtl w:val="0"/>
-        </w:rPr>
-        <w:t xml:space="preserve">Lesson 8: Smart Devices</w:t>
-      </w:r>
-    </w:p>
-    <w:p>
-      <w:pPr>
-        <w:rPr/>
-      </w:pPr>
-      <w:r>
-        <w:rPr>
-          <w:rtl w:val="0"/>
-        </w:rPr>
-      </w:r>
-    </w:p>
-    <w:p>
-      <w:pPr>
-        <w:pStyle w:val="Heading1"/>
-        <w:rPr/>
-      </w:pPr>
-      <w:bookmarkStart w:colFirst="0" w:colLast="0" w:name="_pdsk8yeorcgf" w:id="8"/>
-      <w:bookmarkEnd w:id="8"/>
-      <w:r>
-        <w:rPr>
-          <w:rtl w:val="0"/>
-        </w:rPr>
-        <w:t xml:space="preserve">Lesson 9: Bluetooth</w:t>
-      </w:r>
-    </w:p>
-    <w:p>
-      <w:pPr>
-        <w:rPr/>
-      </w:pPr>
-      <w:r>
-        <w:rPr>
-          <w:rtl w:val="0"/>
-        </w:rPr>
-      </w:r>
-    </w:p>
-    <w:p>
-      <w:pPr>
-        <w:pStyle w:val="Heading1"/>
-        <w:rPr/>
-      </w:pPr>
-      <w:bookmarkStart w:colFirst="0" w:colLast="0" w:name="_lly07nr7p68b" w:id="9"/>
-      <w:bookmarkEnd w:id="9"/>
-      <w:r>
-        <w:rPr>
-          <w:rtl w:val="0"/>
-        </w:rPr>
-        <w:t xml:space="preserve">Lesson 10: Radio-Controlled Robot</w:t>
+        <w:t xml:space="preserve">Add connection light and buzzer</w:t>
       </w:r>
     </w:p>
     <w:p>
@@ -3322,6 +3554,33 @@
               <w:rPr>
                 <w:rtl w:val="0"/>
               </w:rPr>
+              <w:t xml:space="preserve">Using OnShape to design a shape.</w:t>
+            </w:r>
+          </w:p>
+          <w:p>
+            <w:pPr>
+              <w:keepNext w:val="0"/>
+              <w:keepLines w:val="0"/>
+              <w:pageBreakBefore w:val="0"/>
+              <w:widowControl w:val="0"/>
+              <w:pBdr>
+                <w:top w:space="0" w:sz="0" w:val="nil"/>
+                <w:left w:space="0" w:sz="0" w:val="nil"/>
+                <w:bottom w:space="0" w:sz="0" w:val="nil"/>
+                <w:right w:space="0" w:sz="0" w:val="nil"/>
+                <w:between w:space="0" w:sz="0" w:val="nil"/>
+              </w:pBdr>
+              <w:shd w:fill="auto" w:val="clear"/>
+              <w:spacing w:after="0" w:before="0" w:line="240" w:lineRule="auto"/>
+              <w:ind w:left="0" w:right="0" w:firstLine="0"/>
+              <w:jc w:val="left"/>
+              <w:rPr/>
+            </w:pPr>
+            <w:r>
+              <w:rPr>
+                <w:rtl w:val="0"/>
+              </w:rPr>
+              <w:t xml:space="preserve">3D printing</w:t>
             </w:r>
           </w:p>
         </w:tc>
@@ -4009,6 +4268,336 @@
     </w:lvl>
   </w:abstractNum>
   <w:abstractNum w:abstractNumId="7">
+    <w:lvl w:ilvl="0">
+      <w:start w:val="1"/>
+      <w:numFmt w:val="decimal"/>
+      <w:lvlText w:val="%1."/>
+      <w:lvlJc w:val="left"/>
+      <w:pPr>
+        <w:ind w:left="720" w:hanging="360"/>
+      </w:pPr>
+      <w:rPr>
+        <w:u w:val="none"/>
+      </w:rPr>
+    </w:lvl>
+    <w:lvl w:ilvl="1">
+      <w:start w:val="1"/>
+      <w:numFmt w:val="lowerLetter"/>
+      <w:lvlText w:val="%2."/>
+      <w:lvlJc w:val="left"/>
+      <w:pPr>
+        <w:ind w:left="1440" w:hanging="360"/>
+      </w:pPr>
+      <w:rPr>
+        <w:u w:val="none"/>
+      </w:rPr>
+    </w:lvl>
+    <w:lvl w:ilvl="2">
+      <w:start w:val="1"/>
+      <w:numFmt w:val="lowerRoman"/>
+      <w:lvlText w:val="%3."/>
+      <w:lvlJc w:val="right"/>
+      <w:pPr>
+        <w:ind w:left="2160" w:hanging="360"/>
+      </w:pPr>
+      <w:rPr>
+        <w:u w:val="none"/>
+      </w:rPr>
+    </w:lvl>
+    <w:lvl w:ilvl="3">
+      <w:start w:val="1"/>
+      <w:numFmt w:val="decimal"/>
+      <w:lvlText w:val="%4."/>
+      <w:lvlJc w:val="left"/>
+      <w:pPr>
+        <w:ind w:left="2880" w:hanging="360"/>
+      </w:pPr>
+      <w:rPr>
+        <w:u w:val="none"/>
+      </w:rPr>
+    </w:lvl>
+    <w:lvl w:ilvl="4">
+      <w:start w:val="1"/>
+      <w:numFmt w:val="lowerLetter"/>
+      <w:lvlText w:val="%5."/>
+      <w:lvlJc w:val="left"/>
+      <w:pPr>
+        <w:ind w:left="3600" w:hanging="360"/>
+      </w:pPr>
+      <w:rPr>
+        <w:u w:val="none"/>
+      </w:rPr>
+    </w:lvl>
+    <w:lvl w:ilvl="5">
+      <w:start w:val="1"/>
+      <w:numFmt w:val="lowerRoman"/>
+      <w:lvlText w:val="%6."/>
+      <w:lvlJc w:val="right"/>
+      <w:pPr>
+        <w:ind w:left="4320" w:hanging="360"/>
+      </w:pPr>
+      <w:rPr>
+        <w:u w:val="none"/>
+      </w:rPr>
+    </w:lvl>
+    <w:lvl w:ilvl="6">
+      <w:start w:val="1"/>
+      <w:numFmt w:val="decimal"/>
+      <w:lvlText w:val="%7."/>
+      <w:lvlJc w:val="left"/>
+      <w:pPr>
+        <w:ind w:left="5040" w:hanging="360"/>
+      </w:pPr>
+      <w:rPr>
+        <w:u w:val="none"/>
+      </w:rPr>
+    </w:lvl>
+    <w:lvl w:ilvl="7">
+      <w:start w:val="1"/>
+      <w:numFmt w:val="lowerLetter"/>
+      <w:lvlText w:val="%8."/>
+      <w:lvlJc w:val="left"/>
+      <w:pPr>
+        <w:ind w:left="5760" w:hanging="360"/>
+      </w:pPr>
+      <w:rPr>
+        <w:u w:val="none"/>
+      </w:rPr>
+    </w:lvl>
+    <w:lvl w:ilvl="8">
+      <w:start w:val="1"/>
+      <w:numFmt w:val="lowerRoman"/>
+      <w:lvlText w:val="%9."/>
+      <w:lvlJc w:val="right"/>
+      <w:pPr>
+        <w:ind w:left="6480" w:hanging="360"/>
+      </w:pPr>
+      <w:rPr>
+        <w:u w:val="none"/>
+      </w:rPr>
+    </w:lvl>
+  </w:abstractNum>
+  <w:abstractNum w:abstractNumId="8">
+    <w:lvl w:ilvl="0">
+      <w:start w:val="1"/>
+      <w:numFmt w:val="decimal"/>
+      <w:lvlText w:val="%1."/>
+      <w:lvlJc w:val="left"/>
+      <w:pPr>
+        <w:ind w:left="720" w:hanging="360"/>
+      </w:pPr>
+      <w:rPr>
+        <w:u w:val="none"/>
+      </w:rPr>
+    </w:lvl>
+    <w:lvl w:ilvl="1">
+      <w:start w:val="1"/>
+      <w:numFmt w:val="lowerLetter"/>
+      <w:lvlText w:val="%2."/>
+      <w:lvlJc w:val="left"/>
+      <w:pPr>
+        <w:ind w:left="1440" w:hanging="360"/>
+      </w:pPr>
+      <w:rPr>
+        <w:u w:val="none"/>
+      </w:rPr>
+    </w:lvl>
+    <w:lvl w:ilvl="2">
+      <w:start w:val="1"/>
+      <w:numFmt w:val="lowerRoman"/>
+      <w:lvlText w:val="%3."/>
+      <w:lvlJc w:val="right"/>
+      <w:pPr>
+        <w:ind w:left="2160" w:hanging="360"/>
+      </w:pPr>
+      <w:rPr>
+        <w:u w:val="none"/>
+      </w:rPr>
+    </w:lvl>
+    <w:lvl w:ilvl="3">
+      <w:start w:val="1"/>
+      <w:numFmt w:val="decimal"/>
+      <w:lvlText w:val="%4."/>
+      <w:lvlJc w:val="left"/>
+      <w:pPr>
+        <w:ind w:left="2880" w:hanging="360"/>
+      </w:pPr>
+      <w:rPr>
+        <w:u w:val="none"/>
+      </w:rPr>
+    </w:lvl>
+    <w:lvl w:ilvl="4">
+      <w:start w:val="1"/>
+      <w:numFmt w:val="lowerLetter"/>
+      <w:lvlText w:val="%5."/>
+      <w:lvlJc w:val="left"/>
+      <w:pPr>
+        <w:ind w:left="3600" w:hanging="360"/>
+      </w:pPr>
+      <w:rPr>
+        <w:u w:val="none"/>
+      </w:rPr>
+    </w:lvl>
+    <w:lvl w:ilvl="5">
+      <w:start w:val="1"/>
+      <w:numFmt w:val="lowerRoman"/>
+      <w:lvlText w:val="%6."/>
+      <w:lvlJc w:val="right"/>
+      <w:pPr>
+        <w:ind w:left="4320" w:hanging="360"/>
+      </w:pPr>
+      <w:rPr>
+        <w:u w:val="none"/>
+      </w:rPr>
+    </w:lvl>
+    <w:lvl w:ilvl="6">
+      <w:start w:val="1"/>
+      <w:numFmt w:val="decimal"/>
+      <w:lvlText w:val="%7."/>
+      <w:lvlJc w:val="left"/>
+      <w:pPr>
+        <w:ind w:left="5040" w:hanging="360"/>
+      </w:pPr>
+      <w:rPr>
+        <w:u w:val="none"/>
+      </w:rPr>
+    </w:lvl>
+    <w:lvl w:ilvl="7">
+      <w:start w:val="1"/>
+      <w:numFmt w:val="lowerLetter"/>
+      <w:lvlText w:val="%8."/>
+      <w:lvlJc w:val="left"/>
+      <w:pPr>
+        <w:ind w:left="5760" w:hanging="360"/>
+      </w:pPr>
+      <w:rPr>
+        <w:u w:val="none"/>
+      </w:rPr>
+    </w:lvl>
+    <w:lvl w:ilvl="8">
+      <w:start w:val="1"/>
+      <w:numFmt w:val="lowerRoman"/>
+      <w:lvlText w:val="%9."/>
+      <w:lvlJc w:val="right"/>
+      <w:pPr>
+        <w:ind w:left="6480" w:hanging="360"/>
+      </w:pPr>
+      <w:rPr>
+        <w:u w:val="none"/>
+      </w:rPr>
+    </w:lvl>
+  </w:abstractNum>
+  <w:abstractNum w:abstractNumId="9">
+    <w:lvl w:ilvl="0">
+      <w:start w:val="1"/>
+      <w:numFmt w:val="decimal"/>
+      <w:lvlText w:val="%1."/>
+      <w:lvlJc w:val="left"/>
+      <w:pPr>
+        <w:ind w:left="720" w:hanging="360"/>
+      </w:pPr>
+      <w:rPr>
+        <w:u w:val="none"/>
+      </w:rPr>
+    </w:lvl>
+    <w:lvl w:ilvl="1">
+      <w:start w:val="1"/>
+      <w:numFmt w:val="lowerLetter"/>
+      <w:lvlText w:val="%2."/>
+      <w:lvlJc w:val="left"/>
+      <w:pPr>
+        <w:ind w:left="1440" w:hanging="360"/>
+      </w:pPr>
+      <w:rPr>
+        <w:u w:val="none"/>
+      </w:rPr>
+    </w:lvl>
+    <w:lvl w:ilvl="2">
+      <w:start w:val="1"/>
+      <w:numFmt w:val="lowerRoman"/>
+      <w:lvlText w:val="%3."/>
+      <w:lvlJc w:val="right"/>
+      <w:pPr>
+        <w:ind w:left="2160" w:hanging="360"/>
+      </w:pPr>
+      <w:rPr>
+        <w:u w:val="none"/>
+      </w:rPr>
+    </w:lvl>
+    <w:lvl w:ilvl="3">
+      <w:start w:val="1"/>
+      <w:numFmt w:val="decimal"/>
+      <w:lvlText w:val="%4."/>
+      <w:lvlJc w:val="left"/>
+      <w:pPr>
+        <w:ind w:left="2880" w:hanging="360"/>
+      </w:pPr>
+      <w:rPr>
+        <w:u w:val="none"/>
+      </w:rPr>
+    </w:lvl>
+    <w:lvl w:ilvl="4">
+      <w:start w:val="1"/>
+      <w:numFmt w:val="lowerLetter"/>
+      <w:lvlText w:val="%5."/>
+      <w:lvlJc w:val="left"/>
+      <w:pPr>
+        <w:ind w:left="3600" w:hanging="360"/>
+      </w:pPr>
+      <w:rPr>
+        <w:u w:val="none"/>
+      </w:rPr>
+    </w:lvl>
+    <w:lvl w:ilvl="5">
+      <w:start w:val="1"/>
+      <w:numFmt w:val="lowerRoman"/>
+      <w:lvlText w:val="%6."/>
+      <w:lvlJc w:val="right"/>
+      <w:pPr>
+        <w:ind w:left="4320" w:hanging="360"/>
+      </w:pPr>
+      <w:rPr>
+        <w:u w:val="none"/>
+      </w:rPr>
+    </w:lvl>
+    <w:lvl w:ilvl="6">
+      <w:start w:val="1"/>
+      <w:numFmt w:val="decimal"/>
+      <w:lvlText w:val="%7."/>
+      <w:lvlJc w:val="left"/>
+      <w:pPr>
+        <w:ind w:left="5040" w:hanging="360"/>
+      </w:pPr>
+      <w:rPr>
+        <w:u w:val="none"/>
+      </w:rPr>
+    </w:lvl>
+    <w:lvl w:ilvl="7">
+      <w:start w:val="1"/>
+      <w:numFmt w:val="lowerLetter"/>
+      <w:lvlText w:val="%8."/>
+      <w:lvlJc w:val="left"/>
+      <w:pPr>
+        <w:ind w:left="5760" w:hanging="360"/>
+      </w:pPr>
+      <w:rPr>
+        <w:u w:val="none"/>
+      </w:rPr>
+    </w:lvl>
+    <w:lvl w:ilvl="8">
+      <w:start w:val="1"/>
+      <w:numFmt w:val="lowerRoman"/>
+      <w:lvlText w:val="%9."/>
+      <w:lvlJc w:val="right"/>
+      <w:pPr>
+        <w:ind w:left="6480" w:hanging="360"/>
+      </w:pPr>
+      <w:rPr>
+        <w:u w:val="none"/>
+      </w:rPr>
+    </w:lvl>
+  </w:abstractNum>
+  <w:abstractNum w:abstractNumId="10">
     <w:lvl w:ilvl="0">
       <w:start w:val="1"/>
       <w:numFmt w:val="decimal"/>
@@ -4138,6 +4727,15 @@
   </w:num>
   <w:num w:numId="7">
     <w:abstractNumId w:val="7"/>
+  </w:num>
+  <w:num w:numId="8">
+    <w:abstractNumId w:val="8"/>
+  </w:num>
+  <w:num w:numId="9">
+    <w:abstractNumId w:val="9"/>
+  </w:num>
+  <w:num w:numId="10">
+    <w:abstractNumId w:val="10"/>
   </w:num>
 </w:numbering>
 </file>

</xml_diff>